<commit_message>
Auto-publicacio web 4t (dl. 28/09/2026  9:07:14,33)
</commit_message>
<xml_diff>
--- a/public/docs/sa1-guia-docent.docx
+++ b/public/docs/sa1-guia-docent.docx
@@ -1770,7 +1770,7 @@
                 <w:color w:val="1A1A2E"/>
                 <w:sz w:val="18"/>
               </w:rPr>
-              <w:t>App del detector</w:t>
+              <w:t>App del detector (A·B: 14 casos, 5 senyals · C: app pròpia, 10 casos, 3 senyals)</w:t>
             </w:r>
           </w:p>
         </w:tc>
@@ -1810,7 +1810,7 @@
                 <w:color w:val="1A1A2E"/>
                 <w:sz w:val="18"/>
               </w:rPr>
-              <w:t>Entrenament: senyals i calaix de 14 casos</w:t>
+              <w:t>Entrenament: senyals i calaix</w:t>
             </w:r>
           </w:p>
         </w:tc>
@@ -1853,7 +1853,7 @@
                 <w:color w:val="1A1A2E"/>
                 <w:sz w:val="18"/>
               </w:rPr>
-              <w:t>Autoavaluació pre-examen (checklist, assaig escrit, test Power Balance)</w:t>
+              <w:t>Autoavaluació de la SA al web (checklist, pràctica escrita, test Power Balance)</w:t>
             </w:r>
           </w:p>
         </w:tc>
@@ -1893,7 +1893,7 @@
                 <w:color w:val="1A1A2E"/>
                 <w:sz w:val="18"/>
               </w:rPr>
-              <w:t>Si sap aplicar-ho a un cas nou i escriure-ho</w:t>
+              <w:t>Si sap aplicar-ho a un cas nou i escriure-ho. La SA1 no té prova pròpia: la pràctica escrita entrena el bloc de certesa (OA-P4) de la prova final</w:t>
             </w:r>
           </w:p>
         </w:tc>
@@ -1996,7 +1996,7 @@
           <w:color w:val="1A1A2E"/>
           <w:sz w:val="18"/>
         </w:rPr>
-        <w:t>La C (tres alumnes amb DIL) té 3 objectius, tasca pròpia (calaixos, encercla, inicis de frase), 3 senyals (1 · 2 · 3 = no es pot comprovar · no admet crítica · sona científica), lletra Fira Sans Condensed més gran i els mateixos minuts que la B. A l'app, el mode «3 senyals» s'activa sol si la web està en nivell C.</w:t>
+        <w:t>La C (tres alumnes amb DIL) té 3 objectius, tasca pròpia (calaixos, encercla, inicis de frase), 3 senyals (1 · 2 · 3 = no es pot comprovar · no admet crítica · sona científica), lletra Fira Sans Condensed més gran i els mateixos minuts que la B. A la S3 té una app del detector pròpia (app_detector_pseudociencia_C.html): els seus 3 senyals, 10 casos reescrits en frases curtes i sense xifres, una pregunta per pantalla i correcció amb 😀/🤔. El web en versió C l'obre sola.</w:t>
       </w:r>
     </w:p>
     <w:p>
@@ -6542,7 +6542,7 @@
                 <w:color w:val="1A1A2E"/>
                 <w:sz w:val="18"/>
               </w:rPr>
-              <w:t>Reservar ordinadors o tauletes per a l'apartat 1 (25 min). L'app és a la pàgina de la sessió (web/public/apps/app_detector_pseudociencia.html) i funciona sense connexió un cop oberta.</w:t>
+              <w:t>Reservar ordinadors o tauletes per a l'apartat 1 (25 min). L'app és a la pàgina de la sessió i funciona sense connexió un cop oberta.</w:t>
             </w:r>
           </w:p>
           <w:p>
@@ -6567,7 +6567,7 @@
                 <w:color w:val="1A1A2E"/>
                 <w:sz w:val="18"/>
               </w:rPr>
-              <w:t>Comprovar el mode de l'app: surt amb 5 senyals, i amb 3 senyals si el web està en nivell C. Es pot canviar amb el botó de dalt.</w:t>
+              <w:t>Als ordinadors dels alumnes de C, posar el web en versió C: la pàgina de la sessió obre llavors la seva app (3 senyals, 10 casos curts, sempre en el mateix ordre). A·B: app_detector_pseudociencia.html · C: app_detector_pseudociencia_C.html (també a l'Espai docent).</w:t>
             </w:r>
           </w:p>
           <w:p>
@@ -7468,7 +7468,7 @@
                 <w:color w:val="1A1A2E"/>
                 <w:sz w:val="18"/>
               </w:rPr>
-              <w:t xml:space="preserve"> és l'evidència del producte final. Recordar l'Autoavaluació pre-examen del web.</w:t>
+              <w:t xml:space="preserve"> és l'evidència del producte final. Recordar que al web hi ha l'Autoavaluació de la SA per repassar-la.</w:t>
             </w:r>
           </w:p>
         </w:tc>
@@ -7602,7 +7602,7 @@
                 <w:color w:val="1A1A2E"/>
                 <w:sz w:val="18"/>
               </w:rPr>
-              <w:t xml:space="preserve"> la B apunta el resultat i per què falla el senyal. La A busca un cas on no coincideix amb l'app i en defensa l'argument. La C fa servir el mode 3 senyals i només apunta casos i encerts.</w:t>
+              <w:t xml:space="preserve"> la B apunta el resultat i per què falla el senyal. La A busca un cas on no coincideix amb l'app i en defensa l'argument. La C fa servir la seva app (3 senyals, casos curts) i només apunta casos i encerts.</w:t>
             </w:r>
           </w:p>
           <w:p>
@@ -8060,7 +8060,7 @@
                 <w:color w:val="1A1A2E"/>
                 <w:sz w:val="18"/>
               </w:rPr>
-              <w:t>Autoavaluació pre-examen de la SA1 al web: checklist, assaig de prova escrita (a mà, abans de mirar les respostes model) i test de transferència.</w:t>
+              <w:t>Autoavaluació de la SA1 al web: checklist, pràctica escrita (a mà, abans de mirar les respostes model) i un cas nou. La SA1 no té prova pròpia: serveix per repassar i per entrenar el bloc de certesa de la prova final.</w:t>
             </w:r>
           </w:p>
         </w:tc>
@@ -8485,7 +8485,7 @@
                 <w:color w:val="1A1A2E"/>
                 <w:sz w:val="18"/>
               </w:rPr>
-              <w:t>App autocorrectiva del detector (14 casos)</w:t>
+              <w:t>App autocorrectiva del detector (A·B: 14 casos · C: app pròpia, 10 casos)</w:t>
             </w:r>
           </w:p>
         </w:tc>
@@ -8525,7 +8525,7 @@
                 <w:color w:val="1A1A2E"/>
                 <w:sz w:val="18"/>
               </w:rPr>
-              <w:t>Web, a la pàgina de la sessió; mode 3 senyals per a la C</w:t>
+              <w:t>Web, a la pàgina de la sessió; la versió C del web obre la de la C</w:t>
             </w:r>
           </w:p>
         </w:tc>
@@ -8737,7 +8737,7 @@
                 <w:color w:val="1A1A2E"/>
                 <w:sz w:val="18"/>
               </w:rPr>
-              <w:t>Autoavaluació pre-examen</w:t>
+              <w:t>Autoavaluació de la SA</w:t>
             </w:r>
           </w:p>
         </w:tc>

</xml_diff>

<commit_message>
Publica web 4t (30/09/2026): autoavaluació SA2–SA7 amb casos nous, SA1 prova justa
Co-Authored-By: Claude Opus 5.5 <noreply@anthropic.com>
</commit_message>
<xml_diff>
--- a/public/docs/sa1-guia-docent.docx
+++ b/public/docs/sa1-guia-docent.docx
@@ -1095,7 +1095,7 @@
                 <w:color w:val="1A1A2E"/>
                 <w:sz w:val="18"/>
               </w:rPr>
-              <w:t>Posada en comú del puzle + exit tiquet (criteri 3.3)</w:t>
+              <w:t>Laboratori de la prova justa (app) + exit tiquet (criteri 3.3) + avís de l'oral</w:t>
             </w:r>
           </w:p>
         </w:tc>
@@ -1178,7 +1178,7 @@
                 <w:color w:val="1A1A2E"/>
                 <w:sz w:val="18"/>
               </w:rPr>
-              <w:t>Revisió a cegues + autoavaluació + exit tiquet (criteri 3.1)</w:t>
+              <w:t>Revisió a cegues + exposició oral avaluada + exit tiquet amb un cas nou (criteri 3.1)</w:t>
             </w:r>
           </w:p>
         </w:tc>
@@ -1211,7 +1211,7 @@
           <w:color w:val="1A1A2E"/>
           <w:sz w:val="19"/>
         </w:rPr>
-        <w:t>El detector aplicat a un cas real caçat per cada alumne (S3): senyals amb la frase que els encén, calaix i la prova concreta que el decidiria, revisat a cegues per un company. S'hi arriba amb dos entrenaments previs: sis casos treballats a fons al puzle (S2) i catorze casos curts a l'app autocorrectiva (S3). El detector no es tanca amb la SA: és l'eina de la classe per a tot el curs.</w:t>
+        <w:t>El detector aplicat a un cas real caçat per cada alumne (S3): senyals amb la frase que els encén, calaix i la prova concreta que el decidiria, revisat a cegues per un company i exposat oralment (1 min 30 s) davant la classe. S'hi arriba amb dos entrenaments previs: sis casos treballats a fons al puzle (S2), el laboratori de la prova justa (S2) i catorze casos curts a l'app autocorrectiva (S3). El detector no es tanca amb la SA: és l'eina de la classe per a tot el curs.</w:t>
       </w:r>
     </w:p>
     <w:p>
@@ -1395,7 +1395,7 @@
                 <w:color w:val="1A1A2E"/>
                 <w:sz w:val="18"/>
               </w:rPr>
-              <w:t>S1: detectar pseudociència (2.2) · S2: interpretar una prova (3.3) · S3: què faria caure el propi cas (3.1)</w:t>
+              <w:t>S1: detectar pseudociència (2.2) · S2: interpretar una prova (3.3) · S3: transferència a un cas nou, la polsera GreenBeat (3.1): promesa com a hipòtesi, prova justa amb dos grups i què vol dir el resultat</w:t>
             </w:r>
           </w:p>
         </w:tc>
@@ -1582,6 +1582,172 @@
                 <w:sz w:val="18"/>
               </w:rPr>
               <w:t>Observació del docent mentre circula</w:t>
+            </w:r>
+          </w:p>
+        </w:tc>
+      </w:tr>
+      <w:tr>
+        <w:tc>
+          <w:tcPr>
+            <w:tcW w:type="dxa" w:w="2381"/>
+            <w:shd w:val="clear" w:fill="E8F2F4"/>
+          </w:tcPr>
+          <w:p>
+            <w:pPr>
+              <w:spacing w:after="0" w:before="0"/>
+            </w:pPr>
+            <w:r>
+              <w:rPr>
+                <w:rFonts w:ascii="Fira Sans Extra Condensed" w:hAnsi="Fira Sans Extra Condensed" w:cs="Fira Sans Extra Condensed"/>
+                <w:b/>
+                <w:i w:val="0"/>
+                <w:color w:val="1A1A2E"/>
+                <w:sz w:val="18"/>
+              </w:rPr>
+              <w:t>Exposició oral del cas (1 min 30 s + 1 pregunta)</w:t>
+            </w:r>
+          </w:p>
+        </w:tc>
+        <w:tc>
+          <w:tcPr>
+            <w:tcW w:type="dxa" w:w="1077"/>
+          </w:tcPr>
+          <w:p>
+            <w:pPr>
+              <w:spacing w:after="0" w:before="0"/>
+            </w:pPr>
+            <w:r>
+              <w:rPr>
+                <w:rFonts w:ascii="Fira Sans Extra Condensed" w:hAnsi="Fira Sans Extra Condensed" w:cs="Fira Sans Extra Condensed"/>
+                <w:b w:val="0"/>
+                <w:i w:val="0"/>
+                <w:color w:val="1A1A2E"/>
+                <w:sz w:val="18"/>
+              </w:rPr>
+              <w:t>S3</w:t>
+            </w:r>
+          </w:p>
+        </w:tc>
+        <w:tc>
+          <w:tcPr>
+            <w:tcW w:type="dxa" w:w="3288"/>
+          </w:tcPr>
+          <w:p>
+            <w:pPr>
+              <w:spacing w:after="0" w:before="0"/>
+            </w:pPr>
+            <w:r>
+              <w:rPr>
+                <w:rFonts w:ascii="Fira Sans Extra Condensed" w:hAnsi="Fira Sans Extra Condensed" w:cs="Fira Sans Extra Condensed"/>
+                <w:b w:val="0"/>
+                <w:i w:val="0"/>
+                <w:color w:val="1A1A2E"/>
+                <w:sz w:val="18"/>
+              </w:rPr>
+              <w:t>Rúbrica de 4 criteris: fiabilitat i senyals amb la frase (2.2) · la promesa com a hipòtesi comprovable (3.1) · la prova justa amb dos grups (3.2) · conclusió i resposta a la pregunta (1.1). Competències transversals: comunicativa, i personal, social i d'aprendre a aprendre</w:t>
+            </w:r>
+          </w:p>
+        </w:tc>
+        <w:tc>
+          <w:tcPr>
+            <w:tcW w:type="dxa" w:w="3118"/>
+          </w:tcPr>
+          <w:p>
+            <w:pPr>
+              <w:spacing w:after="0" w:before="0"/>
+            </w:pPr>
+            <w:r>
+              <w:rPr>
+                <w:rFonts w:ascii="Fira Sans Extra Condensed" w:hAnsi="Fira Sans Extra Condensed" w:cs="Fira Sans Extra Condensed"/>
+                <w:b w:val="0"/>
+                <w:i w:val="0"/>
+                <w:color w:val="1A1A2E"/>
+                <w:sz w:val="18"/>
+              </w:rPr>
+              <w:t>Rúbrica del docent (nivells d'assoliment); nota al vault «SA1 - Prova justa, exposició oral i tiquet final»</w:t>
+            </w:r>
+          </w:p>
+        </w:tc>
+      </w:tr>
+      <w:tr>
+        <w:tc>
+          <w:tcPr>
+            <w:tcW w:type="dxa" w:w="2381"/>
+            <w:shd w:val="clear" w:fill="E8F2F4"/>
+          </w:tcPr>
+          <w:p>
+            <w:pPr>
+              <w:spacing w:after="0" w:before="0"/>
+            </w:pPr>
+            <w:r>
+              <w:rPr>
+                <w:rFonts w:ascii="Fira Sans Extra Condensed" w:hAnsi="Fira Sans Extra Condensed" w:cs="Fira Sans Extra Condensed"/>
+                <w:b/>
+                <w:i w:val="0"/>
+                <w:color w:val="1A1A2E"/>
+                <w:sz w:val="18"/>
+              </w:rPr>
+              <w:t>Laboratori de la prova justa (app ZenStop)</w:t>
+            </w:r>
+          </w:p>
+        </w:tc>
+        <w:tc>
+          <w:tcPr>
+            <w:tcW w:type="dxa" w:w="1077"/>
+          </w:tcPr>
+          <w:p>
+            <w:pPr>
+              <w:spacing w:after="0" w:before="0"/>
+            </w:pPr>
+            <w:r>
+              <w:rPr>
+                <w:rFonts w:ascii="Fira Sans Extra Condensed" w:hAnsi="Fira Sans Extra Condensed" w:cs="Fira Sans Extra Condensed"/>
+                <w:b w:val="0"/>
+                <w:i w:val="0"/>
+                <w:color w:val="1A1A2E"/>
+                <w:sz w:val="18"/>
+              </w:rPr>
+              <w:t>S2</w:t>
+            </w:r>
+          </w:p>
+        </w:tc>
+        <w:tc>
+          <w:tcPr>
+            <w:tcW w:type="dxa" w:w="3288"/>
+          </w:tcPr>
+          <w:p>
+            <w:pPr>
+              <w:spacing w:after="0" w:before="0"/>
+            </w:pPr>
+            <w:r>
+              <w:rPr>
+                <w:rFonts w:ascii="Fira Sans Extra Condensed" w:hAnsi="Fira Sans Extra Condensed" w:cs="Fira Sans Extra Condensed"/>
+                <w:b w:val="0"/>
+                <w:i w:val="0"/>
+                <w:color w:val="1A1A2E"/>
+                <w:sz w:val="18"/>
+              </w:rPr>
+              <w:t>Les quatre peces d'una prova justa (A: també el control positiu) i el motlle aplicat a un cas</w:t>
+            </w:r>
+          </w:p>
+        </w:tc>
+        <w:tc>
+          <w:tcPr>
+            <w:tcW w:type="dxa" w:w="3118"/>
+          </w:tcPr>
+          <w:p>
+            <w:pPr>
+              <w:spacing w:after="0" w:before="0"/>
+            </w:pPr>
+            <w:r>
+              <w:rPr>
+                <w:rFonts w:ascii="Fira Sans Extra Condensed" w:hAnsi="Fira Sans Extra Condensed" w:cs="Fira Sans Extra Condensed"/>
+                <w:b w:val="0"/>
+                <w:i w:val="0"/>
+                <w:color w:val="1A1A2E"/>
+                <w:sz w:val="18"/>
+              </w:rPr>
+              <w:t>Autocorrectiu; la fitxa, apartat 3, recull les paraules i el motlle</w:t>
             </w:r>
           </w:p>
         </w:tc>
@@ -4458,7 +4624,7 @@
           <w:color w:val="1A1A2E"/>
           <w:sz w:val="18"/>
         </w:rPr>
-        <w:t>Explicar què té una prova justa: grup de comparació i ningú no sap qui rep què.</w:t>
+        <w:t>Explicar què fa justa una prova: comparació, a l'atzar, a cegues i prou gent (A: i control positiu).</w:t>
       </w:r>
     </w:p>
     <w:tbl>
@@ -4624,6 +4790,31 @@
                 <w:sz w:val="18"/>
               </w:rPr>
               <w:t>Imprimir la fitxa S2 (A/B/C) i l'exit tiquet. Tenir a mà la clau docent (Espai docent del web).</w:t>
+            </w:r>
+          </w:p>
+          <w:p>
+            <w:pPr>
+              <w:spacing w:after="20" w:before="0"/>
+            </w:pPr>
+            <w:r>
+              <w:rPr>
+                <w:rFonts w:ascii="Fira Sans Extra Condensed" w:hAnsi="Fira Sans Extra Condensed" w:cs="Fira Sans Extra Condensed"/>
+                <w:b/>
+                <w:i w:val="0"/>
+                <w:color w:val="2A6F7F"/>
+                <w:sz w:val="18"/>
+              </w:rPr>
+              <w:t xml:space="preserve">6 </w:t>
+            </w:r>
+            <w:r>
+              <w:rPr>
+                <w:rFonts w:ascii="Fira Sans Extra Condensed" w:hAnsi="Fira Sans Extra Condensed" w:cs="Fira Sans Extra Condensed"/>
+                <w:b w:val="0"/>
+                <w:i w:val="0"/>
+                <w:color w:val="1A1A2E"/>
+                <w:sz w:val="18"/>
+              </w:rPr>
+              <w:t>Per a l'apartat 3 (30 min): una pantalla per parella amb la pàgina de la sessió; l'app del laboratori de la prova justa hi surt a l'apartat 3. A·B: app_prova_justa.html (la A hi fa també el pas 6) · C: app_prova_justa_C.html (3 passos, grups de 10).</w:t>
             </w:r>
           </w:p>
         </w:tc>
@@ -4763,7 +4954,7 @@
                 <w:color w:val="666666"/>
                 <w:sz w:val="17"/>
               </w:rPr>
-              <w:t>10 min · apartat 0</w:t>
+              <w:t>5 min · apartat 0</w:t>
             </w:r>
           </w:p>
         </w:tc>
@@ -5340,7 +5531,7 @@
                 <w:color w:val="666666"/>
                 <w:sz w:val="17"/>
               </w:rPr>
-              <w:t>15 min · apartat 3</w:t>
+              <w:t>30 min · apartat 3</w:t>
             </w:r>
           </w:p>
         </w:tc>
@@ -5370,7 +5561,7 @@
                 <w:color w:val="1A1A2E"/>
                 <w:sz w:val="18"/>
               </w:rPr>
-              <w:t>Posada en comú amb dues preguntes:</w:t>
+              <w:t>Laboratori de la prova justa, en parelles (20 min):</w:t>
             </w:r>
             <w:r>
               <w:rPr>
@@ -5380,7 +5571,7 @@
                 <w:color w:val="1A1A2E"/>
                 <w:sz w:val="18"/>
               </w:rPr>
-              <w:t xml:space="preserve"> (a) per què el cas 5 fa fàstic però no encén el detector? (b) què tenien en comú les proves justes dels casos 3, 4 i 5?</w:t>
+              <w:t xml:space="preserve"> l'app del xiclet ZenStop. Cada pas amaga una trampa (s'hauria curat sol · grups diferents d'entrada · m'ho crec i ho noto · guanyar per sort) i la paraula que la desmunta surt al requadre «La trampa»: la copien a la taula de la fitxa. No es pot passar de pas sense encertar la pregunta.</w:t>
             </w:r>
           </w:p>
           <w:p>
@@ -5405,7 +5596,7 @@
                 <w:color w:val="1A1A2E"/>
                 <w:sz w:val="18"/>
               </w:rPr>
-              <w:t>Construir a la pissarra la llista de la prova justa:</w:t>
+              <w:t>Posada en comú (10 min) amb la figura «Anatomia d'una prova justa»:</w:t>
             </w:r>
             <w:r>
               <w:rPr>
@@ -5415,7 +5606,7 @@
                 <w:color w:val="1A1A2E"/>
                 <w:sz w:val="18"/>
               </w:rPr>
-              <w:t xml:space="preserve"> grup de comparació, repartir a l'atzar, ningú no sap qui rep què, prou gent, repetir-ho, i acceptar el resultat.</w:t>
+              <w:t xml:space="preserve"> les quatre peces a la pissarra i el motlle omplert amb el cas 1. Pregunta de tancament: què tenien les proves dels casos 3, 4 i 5 que no tenia el cas 1?</w:t>
             </w:r>
           </w:p>
           <w:p>
@@ -5440,7 +5631,7 @@
                 <w:color w:val="1A1A2E"/>
                 <w:sz w:val="18"/>
               </w:rPr>
-              <w:t>Si queda temps, el cas 6:</w:t>
+              <w:t>Al pas 5, insistir a prémer «Repeteix» diverses vegades:</w:t>
             </w:r>
             <w:r>
               <w:rPr>
@@ -5450,7 +5641,7 @@
                 <w:color w:val="1A1A2E"/>
                 <w:sz w:val="18"/>
               </w:rPr>
-              <w:t xml:space="preserve"> el mateix tema és «encara no comprovat» als investigadors i pseudociència a la influencer.</w:t>
+              <w:t xml:space="preserve"> amb 4 persones per grup el xiclet «guanya» sovint per sort; amb 40, gairebé mai.</w:t>
             </w:r>
           </w:p>
         </w:tc>
@@ -5481,7 +5672,32 @@
                 <w:color w:val="1A1A2E"/>
                 <w:sz w:val="18"/>
               </w:rPr>
-              <w:t>Escriuen les respostes a) i b) (A: el cas 6 i ordenar les proves per justícia).</w:t>
+              <w:t>Fan els passos de l'app i copien la paraula de cada trampa (A: també el pas 6, control positiu).</w:t>
+            </w:r>
+          </w:p>
+          <w:p>
+            <w:pPr>
+              <w:spacing w:after="20" w:before="0"/>
+            </w:pPr>
+            <w:r>
+              <w:rPr>
+                <w:rFonts w:ascii="Fira Sans Extra Condensed" w:hAnsi="Fira Sans Extra Condensed" w:cs="Fira Sans Extra Condensed"/>
+                <w:b/>
+                <w:i w:val="0"/>
+                <w:color w:val="2A6F7F"/>
+                <w:sz w:val="18"/>
+              </w:rPr>
+              <w:t xml:space="preserve">• </w:t>
+            </w:r>
+            <w:r>
+              <w:rPr>
+                <w:rFonts w:ascii="Fira Sans Extra Condensed" w:hAnsi="Fira Sans Extra Condensed" w:cs="Fira Sans Extra Condensed"/>
+                <w:b w:val="0"/>
+                <w:i w:val="0"/>
+                <w:color w:val="1A1A2E"/>
+                <w:sz w:val="18"/>
+              </w:rPr>
+              <w:t>Omplen el motlle de la prova justa (B: cas 1; A: cas 6 i quanta gent hi posarien; C: completen el motlle amb SOL · CREUS · SORT).</w:t>
             </w:r>
           </w:p>
         </w:tc>
@@ -5519,7 +5735,7 @@
                 <w:color w:val="666666"/>
                 <w:sz w:val="17"/>
               </w:rPr>
-              <w:t>13 min</w:t>
+              <w:t>5 min</w:t>
             </w:r>
           </w:p>
         </w:tc>
@@ -5549,7 +5765,7 @@
                 <w:color w:val="1A1A2E"/>
                 <w:sz w:val="18"/>
               </w:rPr>
-              <w:t>Exit tiquet imprès (10 min):</w:t>
+              <w:t>Exit tiquet imprès:</w:t>
             </w:r>
             <w:r>
               <w:rPr>
@@ -5559,7 +5775,7 @@
                 <w:color w:val="1A1A2E"/>
                 <w:sz w:val="18"/>
               </w:rPr>
-              <w:t xml:space="preserve"> un cas del puzle que s'hagi posat a prova (que no sigui el propi): com, què en van concloure i per què era justa. Avalua el criteri 3.3.</w:t>
+              <w:t xml:space="preserve"> un cas del puzle que s'hagi posat a prova (que no sigui el propi): com, què en van concloure i per què era justa. Avalua el criteri 3.3. Si no hi ha temps, que el facin al web a casa.</w:t>
             </w:r>
           </w:p>
           <w:p>
@@ -5584,7 +5800,7 @@
                 <w:color w:val="1A1A2E"/>
                 <w:sz w:val="18"/>
               </w:rPr>
-              <w:t>Metacognició (3 min)</w:t>
+              <w:t>Avís en veu alta (1 min):</w:t>
             </w:r>
             <w:r>
               <w:rPr>
@@ -5594,7 +5810,7 @@
                 <w:color w:val="1A1A2E"/>
                 <w:sz w:val="18"/>
               </w:rPr>
-              <w:t xml:space="preserve"> i recordar que la S3 es fa amb el cas caçat.</w:t>
+              <w:t xml:space="preserve"> a la S3 cadascú exposarà el seu cas en 1 min 30 s i s'avaluarà. Guió a peu de fitxa: què promet → senyals amb la frase → com ho comprovaria amb dos grups → calaix. Que ho assagin una vegada a casa.</w:t>
             </w:r>
           </w:p>
         </w:tc>
@@ -5625,7 +5841,7 @@
                 <w:color w:val="1A1A2E"/>
                 <w:sz w:val="18"/>
               </w:rPr>
-              <w:t>Fan l'exit tiquet i la metacognició.</w:t>
+              <w:t>Fan l'exit tiquet i apunten l'encàrrec de l'oral.</w:t>
             </w:r>
           </w:p>
         </w:tc>
@@ -5773,7 +5989,7 @@
                 <w:color w:val="1A1A2E"/>
                 <w:sz w:val="18"/>
               </w:rPr>
-              <w:t xml:space="preserve"> la B respon les preguntes a) i b). La A explica el cas 6 (el calaix depèn de com es presenta) i ordena les proves de més justa a menys justa. La C explica per què el cas 5 és ciència amb un inici de frase.</w:t>
+              <w:t xml:space="preserve"> tots fan l'app del laboratori. La B copia les quatre paraules i omple el motlle amb el cas 1 (la bastida li recorda on surt la paraula). La A fa també el pas 6 (control positiu) i aplica el motlle al cas 6 dient quanta gent hi posaria; té els senyals escrits per dir quin encendria la influencer si la prova li sortís en contra. La C fa la seva app (3 passos) i completa el motlle amb SOL · CREUS · SORT.</w:t>
             </w:r>
           </w:p>
         </w:tc>
@@ -6209,6 +6425,31 @@
               <w:t>Cronòmetre visible per a les rondes del puzle.</w:t>
             </w:r>
           </w:p>
+          <w:p>
+            <w:pPr>
+              <w:spacing w:after="20" w:before="0"/>
+            </w:pPr>
+            <w:r>
+              <w:rPr>
+                <w:rFonts w:ascii="Fira Sans Extra Condensed" w:hAnsi="Fira Sans Extra Condensed" w:cs="Fira Sans Extra Condensed"/>
+                <w:b/>
+                <w:i w:val="0"/>
+                <w:color w:val="2A6F7F"/>
+                <w:sz w:val="18"/>
+              </w:rPr>
+              <w:t xml:space="preserve">• </w:t>
+            </w:r>
+            <w:r>
+              <w:rPr>
+                <w:rFonts w:ascii="Fira Sans Extra Condensed" w:hAnsi="Fira Sans Extra Condensed" w:cs="Fira Sans Extra Condensed"/>
+                <w:b w:val="0"/>
+                <w:i w:val="0"/>
+                <w:color w:val="1A1A2E"/>
+                <w:sz w:val="18"/>
+              </w:rPr>
+              <w:t>Una pantalla per parella amb l'app del laboratori de la prova justa (apartat 3) i la figura «Anatomia d'una prova justa» projectada.</w:t>
+            </w:r>
+          </w:p>
         </w:tc>
         <w:tc>
           <w:tcPr>
@@ -6237,6 +6478,31 @@
                 <w:sz w:val="18"/>
               </w:rPr>
               <w:t>Portar el cas caçat a la S3 (foto o frase de la promesa). Qui no en tingui, hi haurà casos de reserva.</w:t>
+            </w:r>
+          </w:p>
+          <w:p>
+            <w:pPr>
+              <w:spacing w:after="20" w:before="0"/>
+            </w:pPr>
+            <w:r>
+              <w:rPr>
+                <w:rFonts w:ascii="Fira Sans Extra Condensed" w:hAnsi="Fira Sans Extra Condensed" w:cs="Fira Sans Extra Condensed"/>
+                <w:b/>
+                <w:i w:val="0"/>
+                <w:color w:val="2A6F7F"/>
+                <w:sz w:val="18"/>
+              </w:rPr>
+              <w:t xml:space="preserve">2 </w:t>
+            </w:r>
+            <w:r>
+              <w:rPr>
+                <w:rFonts w:ascii="Fira Sans Extra Condensed" w:hAnsi="Fira Sans Extra Condensed" w:cs="Fira Sans Extra Condensed"/>
+                <w:b w:val="0"/>
+                <w:i w:val="0"/>
+                <w:color w:val="1A1A2E"/>
+                <w:sz w:val="18"/>
+              </w:rPr>
+              <w:t>Preparar l'exposició oral del cas (1 min 30 s) seguint el guió de peu de fitxa i assajar-la una vegada en veu alta.</w:t>
             </w:r>
           </w:p>
         </w:tc>
@@ -6480,6 +6746,56 @@
         <w:t>Revisar el cas d'un company a cegues i comparar els veredictes.</w:t>
       </w:r>
     </w:p>
+    <w:p>
+      <w:pPr>
+        <w:spacing w:before="0" w:after="20"/>
+      </w:pPr>
+      <w:r>
+        <w:rPr>
+          <w:rFonts w:ascii="Fira Sans Extra Condensed" w:hAnsi="Fira Sans Extra Condensed" w:cs="Fira Sans Extra Condensed"/>
+          <w:b/>
+          <w:i w:val="0"/>
+          <w:color w:val="2A6F7F"/>
+          <w:sz w:val="18"/>
+        </w:rPr>
+        <w:t xml:space="preserve">• </w:t>
+      </w:r>
+      <w:r>
+        <w:rPr>
+          <w:rFonts w:ascii="Fira Sans Extra Condensed" w:hAnsi="Fira Sans Extra Condensed" w:cs="Fira Sans Extra Condensed"/>
+          <w:b w:val="0"/>
+          <w:i w:val="0"/>
+          <w:color w:val="1A1A2E"/>
+          <w:sz w:val="18"/>
+        </w:rPr>
+        <w:t>Exposar el propi cas oralment (1 min 30 s) i respondre una pregunta.</w:t>
+      </w:r>
+    </w:p>
+    <w:p>
+      <w:pPr>
+        <w:spacing w:before="0" w:after="20"/>
+      </w:pPr>
+      <w:r>
+        <w:rPr>
+          <w:rFonts w:ascii="Fira Sans Extra Condensed" w:hAnsi="Fira Sans Extra Condensed" w:cs="Fira Sans Extra Condensed"/>
+          <w:b/>
+          <w:i w:val="0"/>
+          <w:color w:val="2A6F7F"/>
+          <w:sz w:val="18"/>
+        </w:rPr>
+        <w:t xml:space="preserve">• </w:t>
+      </w:r>
+      <w:r>
+        <w:rPr>
+          <w:rFonts w:ascii="Fira Sans Extra Condensed" w:hAnsi="Fira Sans Extra Condensed" w:cs="Fira Sans Extra Condensed"/>
+          <w:b w:val="0"/>
+          <w:i w:val="0"/>
+          <w:color w:val="1A1A2E"/>
+          <w:sz w:val="18"/>
+        </w:rPr>
+        <w:t>Aplicar el detector i la prova justa a un cas nou (exit tiquet GreenBeat).</w:t>
+      </w:r>
+    </w:p>
     <w:tbl>
       <w:tblPr>
         <w:tblW w:type="auto" w:w="0"/>
@@ -6542,7 +6858,7 @@
                 <w:color w:val="1A1A2E"/>
                 <w:sz w:val="18"/>
               </w:rPr>
-              <w:t>Reservar ordinadors o tauletes per a l'apartat 1 (25 min). L'app és a la pàgina de la sessió i funciona sense connexió un cop oberta.</w:t>
+              <w:t>Reservar ordinadors o tauletes per a l'apartat 1 (20 min). L'app és a la pàgina de la sessió i funciona sense connexió un cop oberta.</w:t>
             </w:r>
           </w:p>
           <w:p>
@@ -6617,7 +6933,32 @@
                 <w:color w:val="1A1A2E"/>
                 <w:sz w:val="18"/>
               </w:rPr>
-              <w:t>Imprimir la fitxa S3 (A/B/C) i l'exit tiquet.</w:t>
+              <w:t>Imprimir la fitxa S3 (A/B/C) i l'exit tiquet (cas GreenBeat).</w:t>
+            </w:r>
+          </w:p>
+          <w:p>
+            <w:pPr>
+              <w:spacing w:after="20" w:before="0"/>
+            </w:pPr>
+            <w:r>
+              <w:rPr>
+                <w:rFonts w:ascii="Fira Sans Extra Condensed" w:hAnsi="Fira Sans Extra Condensed" w:cs="Fira Sans Extra Condensed"/>
+                <w:b/>
+                <w:i w:val="0"/>
+                <w:color w:val="2A6F7F"/>
+                <w:sz w:val="18"/>
+              </w:rPr>
+              <w:t xml:space="preserve">5 </w:t>
+            </w:r>
+            <w:r>
+              <w:rPr>
+                <w:rFonts w:ascii="Fira Sans Extra Condensed" w:hAnsi="Fira Sans Extra Condensed" w:cs="Fira Sans Extra Condensed"/>
+                <w:b w:val="0"/>
+                <w:i w:val="0"/>
+                <w:color w:val="1A1A2E"/>
+                <w:sz w:val="18"/>
+              </w:rPr>
+              <w:t>Tenir la rúbrica de l'oral (4 criteris: 2.2 · 3.1 · 3.2 · 1.1) en una llista de classe per anotar mentre exposen. Amb 30 alumnes, 40 min no hi arriben: 3-4 exposicions poden passar a l'inici de la sessió següent.</w:t>
             </w:r>
           </w:p>
         </w:tc>
@@ -6757,7 +7098,7 @@
                 <w:color w:val="666666"/>
                 <w:sz w:val="17"/>
               </w:rPr>
-              <w:t>10 min · apartat 0</w:t>
+              <w:t>5 min · apartat 0</w:t>
             </w:r>
           </w:p>
         </w:tc>
@@ -6901,7 +7242,7 @@
                 <w:color w:val="666666"/>
                 <w:sz w:val="17"/>
               </w:rPr>
-              <w:t>25 min · apartat 1</w:t>
+              <w:t>20 min · apartat 1</w:t>
             </w:r>
           </w:p>
         </w:tc>
@@ -7007,7 +7348,7 @@
                 <w:color w:val="1A1A2E"/>
                 <w:sz w:val="18"/>
               </w:rPr>
-              <w:t>Fan com a mínim 8 casos a l'app.</w:t>
+              <w:t>Fan com a mínim 6 casos a l'app.</w:t>
             </w:r>
           </w:p>
           <w:p>
@@ -7032,7 +7373,7 @@
                 <w:color w:val="1A1A2E"/>
                 <w:sz w:val="18"/>
               </w:rPr>
-              <w:t>Apunten casos, encerts i el senyal que més fallen (A: un cas on no coincideixen amb l'app i per què).</w:t>
+              <w:t>Apunten casos, encerts i el senyal que més fallen (A: tenen els cinc senyals escrits al repte i els apliquen cas per cas).</w:t>
             </w:r>
           </w:p>
         </w:tc>
@@ -7214,7 +7555,7 @@
                 <w:color w:val="666666"/>
                 <w:sz w:val="17"/>
               </w:rPr>
-              <w:t>20 min · apartat 3</w:t>
+              <w:t>15 min · apartat 3</w:t>
             </w:r>
           </w:p>
         </w:tc>
@@ -7358,7 +7699,7 @@
                 <w:color w:val="666666"/>
                 <w:sz w:val="17"/>
               </w:rPr>
-              <w:t>25 min · apartat 4</w:t>
+              <w:t>40 min · apartat 4</w:t>
             </w:r>
           </w:p>
         </w:tc>
@@ -7388,7 +7729,7 @@
                 <w:color w:val="1A1A2E"/>
                 <w:sz w:val="18"/>
               </w:rPr>
-              <w:t>Autoavaluació de la SA (15 min):</w:t>
+              <w:t>Exposició oral del cas (1 min 30 s + 1 pregunta):</w:t>
             </w:r>
             <w:r>
               <w:rPr>
@@ -7398,7 +7739,7 @@
                 <w:color w:val="1A1A2E"/>
                 <w:sz w:val="18"/>
               </w:rPr>
-              <w:t xml:space="preserve"> els quatre objectius, amb «ho domino · a mitges · ho he de repassar», i una situació de la seva vida on faran servir el detector.</w:t>
+              <w:t xml:space="preserve"> guió de la fitxa: què promet → senyals amb la frase que els encén → com ho comprovaria amb dos grups → calaix. El docent fa una sola pregunta (p. ex. «quin resultat et faria canviar de calaix?») i anota la rúbrica.</w:t>
             </w:r>
           </w:p>
           <w:p>
@@ -7423,7 +7764,7 @@
                 <w:color w:val="1A1A2E"/>
                 <w:sz w:val="18"/>
               </w:rPr>
-              <w:t>Exit tiquet imprès (10 min):</w:t>
+              <w:t>Rúbrica (nivells d'assoliment):</w:t>
             </w:r>
             <w:r>
               <w:rPr>
@@ -7433,7 +7774,7 @@
                 <w:color w:val="1A1A2E"/>
                 <w:sz w:val="18"/>
               </w:rPr>
-              <w:t xml:space="preserve"> la promesa del propi cas i quina prova la podria fer caure. Avalua el criteri 3.1.</w:t>
+              <w:t xml:space="preserve"> 2.2 senyals amb la frase literal · 3.1 promesa com a hipòtesi comprovable (si… aleshores…) · 3.2 prova justa: dos grups, atzar, a cegues, prou gent · 1.1 conclusió raonada i resposta a la pregunta. Transversals: comunicativa i personal, social i d'aprendre a aprendre.</w:t>
             </w:r>
           </w:p>
           <w:p>
@@ -7458,6 +7799,210 @@
                 <w:color w:val="1A1A2E"/>
                 <w:sz w:val="18"/>
               </w:rPr>
+              <w:t>Mentre exposen, la resta escolta amb una tasca:</w:t>
+            </w:r>
+            <w:r>
+              <w:rPr>
+                <w:rFonts w:ascii="Fira Sans Extra Condensed" w:hAnsi="Fira Sans Extra Condensed" w:cs="Fira Sans Extra Condensed"/>
+                <w:b w:val="0"/>
+                <w:i w:val="0"/>
+                <w:color w:val="1A1A2E"/>
+                <w:sz w:val="18"/>
+              </w:rPr>
+              <w:t xml:space="preserve"> apunten a la fitxa quin senyal ha sortit més vegades a la classe (A i B). Tallar a 1 min 30 s amb el cronòmetre visible.</w:t>
+            </w:r>
+          </w:p>
+        </w:tc>
+        <w:tc>
+          <w:tcPr>
+            <w:tcW w:type="dxa" w:w="4025"/>
+            <w:shd w:val="clear" w:fill="F4F9FA"/>
+          </w:tcPr>
+          <w:p>
+            <w:pPr>
+              <w:spacing w:after="20" w:before="0"/>
+            </w:pPr>
+            <w:r>
+              <w:rPr>
+                <w:rFonts w:ascii="Fira Sans Extra Condensed" w:hAnsi="Fira Sans Extra Condensed" w:cs="Fira Sans Extra Condensed"/>
+                <w:b/>
+                <w:i w:val="0"/>
+                <w:color w:val="2A6F7F"/>
+                <w:sz w:val="18"/>
+              </w:rPr>
+              <w:t xml:space="preserve">• </w:t>
+            </w:r>
+            <w:r>
+              <w:rPr>
+                <w:rFonts w:ascii="Fira Sans Extra Condensed" w:hAnsi="Fira Sans Extra Condensed" w:cs="Fira Sans Extra Condensed"/>
+                <w:b w:val="0"/>
+                <w:i w:val="0"/>
+                <w:color w:val="1A1A2E"/>
+                <w:sz w:val="18"/>
+              </w:rPr>
+              <w:t>Exposen el seu cas i responen la pregunta.</w:t>
+            </w:r>
+          </w:p>
+          <w:p>
+            <w:pPr>
+              <w:spacing w:after="20" w:before="0"/>
+            </w:pPr>
+            <w:r>
+              <w:rPr>
+                <w:rFonts w:ascii="Fira Sans Extra Condensed" w:hAnsi="Fira Sans Extra Condensed" w:cs="Fira Sans Extra Condensed"/>
+                <w:b/>
+                <w:i w:val="0"/>
+                <w:color w:val="2A6F7F"/>
+                <w:sz w:val="18"/>
+              </w:rPr>
+              <w:t xml:space="preserve">• </w:t>
+            </w:r>
+            <w:r>
+              <w:rPr>
+                <w:rFonts w:ascii="Fira Sans Extra Condensed" w:hAnsi="Fira Sans Extra Condensed" w:cs="Fira Sans Extra Condensed"/>
+                <w:b w:val="0"/>
+                <w:i w:val="0"/>
+                <w:color w:val="1A1A2E"/>
+                <w:sz w:val="18"/>
+              </w:rPr>
+              <w:t>Escolten i apunten el senyal més repetit.</w:t>
+            </w:r>
+          </w:p>
+        </w:tc>
+      </w:tr>
+      <w:tr>
+        <w:tc>
+          <w:tcPr>
+            <w:tcW w:type="dxa" w:w="1644"/>
+            <w:shd w:val="clear" w:fill="E8F2F4"/>
+          </w:tcPr>
+          <w:p>
+            <w:pPr>
+              <w:spacing w:after="0" w:before="0"/>
+            </w:pPr>
+            <w:r>
+              <w:rPr>
+                <w:rFonts w:ascii="Fira Sans Extra Condensed" w:hAnsi="Fira Sans Extra Condensed" w:cs="Fira Sans Extra Condensed"/>
+                <w:b/>
+                <w:i w:val="0"/>
+                <w:color w:val="2A6F7F"/>
+                <w:sz w:val="21"/>
+              </w:rPr>
+              <w:t>Evaluate</w:t>
+            </w:r>
+          </w:p>
+          <w:p>
+            <w:pPr>
+              <w:spacing w:after="0" w:before="0"/>
+            </w:pPr>
+            <w:r>
+              <w:rPr>
+                <w:rFonts w:ascii="Fira Sans Extra Condensed" w:hAnsi="Fira Sans Extra Condensed" w:cs="Fira Sans Extra Condensed"/>
+                <w:b w:val="0"/>
+                <w:i w:val="0"/>
+                <w:color w:val="666666"/>
+                <w:sz w:val="17"/>
+              </w:rPr>
+              <w:t>15 min · apartat 5</w:t>
+            </w:r>
+          </w:p>
+        </w:tc>
+        <w:tc>
+          <w:tcPr>
+            <w:tcW w:type="dxa" w:w="4195"/>
+          </w:tcPr>
+          <w:p>
+            <w:pPr>
+              <w:spacing w:after="20" w:before="0"/>
+            </w:pPr>
+            <w:r>
+              <w:rPr>
+                <w:rFonts w:ascii="Fira Sans Extra Condensed" w:hAnsi="Fira Sans Extra Condensed" w:cs="Fira Sans Extra Condensed"/>
+                <w:b/>
+                <w:i w:val="0"/>
+                <w:color w:val="2A6F7F"/>
+                <w:sz w:val="18"/>
+              </w:rPr>
+              <w:t xml:space="preserve">• </w:t>
+            </w:r>
+            <w:r>
+              <w:rPr>
+                <w:rFonts w:ascii="Fira Sans Extra Condensed" w:hAnsi="Fira Sans Extra Condensed" w:cs="Fira Sans Extra Condensed"/>
+                <w:b/>
+                <w:i w:val="0"/>
+                <w:color w:val="1A1A2E"/>
+                <w:sz w:val="18"/>
+              </w:rPr>
+              <w:t>Autoavaluació de la SA (5 min):</w:t>
+            </w:r>
+            <w:r>
+              <w:rPr>
+                <w:rFonts w:ascii="Fira Sans Extra Condensed" w:hAnsi="Fira Sans Extra Condensed" w:cs="Fira Sans Extra Condensed"/>
+                <w:b w:val="0"/>
+                <w:i w:val="0"/>
+                <w:color w:val="1A1A2E"/>
+                <w:sz w:val="18"/>
+              </w:rPr>
+              <w:t xml:space="preserve"> els objectius, amb «ho domino · a mitges · ho he de repassar».</w:t>
+            </w:r>
+          </w:p>
+          <w:p>
+            <w:pPr>
+              <w:spacing w:after="20" w:before="0"/>
+            </w:pPr>
+            <w:r>
+              <w:rPr>
+                <w:rFonts w:ascii="Fira Sans Extra Condensed" w:hAnsi="Fira Sans Extra Condensed" w:cs="Fira Sans Extra Condensed"/>
+                <w:b/>
+                <w:i w:val="0"/>
+                <w:color w:val="2A6F7F"/>
+                <w:sz w:val="18"/>
+              </w:rPr>
+              <w:t xml:space="preserve">• </w:t>
+            </w:r>
+            <w:r>
+              <w:rPr>
+                <w:rFonts w:ascii="Fira Sans Extra Condensed" w:hAnsi="Fira Sans Extra Condensed" w:cs="Fira Sans Extra Condensed"/>
+                <w:b/>
+                <w:i w:val="0"/>
+                <w:color w:val="1A1A2E"/>
+                <w:sz w:val="18"/>
+              </w:rPr>
+              <w:t>Exit tiquet imprès (10 min), amb un cas NOU:</w:t>
+            </w:r>
+            <w:r>
+              <w:rPr>
+                <w:rFonts w:ascii="Fira Sans Extra Condensed" w:hAnsi="Fira Sans Extra Condensed" w:cs="Fira Sans Extra Condensed"/>
+                <w:b w:val="0"/>
+                <w:i w:val="0"/>
+                <w:color w:val="1A1A2E"/>
+                <w:sz w:val="18"/>
+              </w:rPr>
+              <w:t xml:space="preserve"> la polsera GreenBeat. Ja han defensat el seu cas a l'oral; aquí es mira si transfereixen: (1) la promesa en forma «si… aleshores…», (2) la taula de la prova justa (què rep cada grup, a l'atzar, a cegues, què es mesura), (3) què vol dir que els dos grups surtin igual i quin senyal encén l'excusa «és que la teva energia no hi estava oberta». Avalua el criteri 3.1.</w:t>
+            </w:r>
+          </w:p>
+          <w:p>
+            <w:pPr>
+              <w:spacing w:after="20" w:before="0"/>
+            </w:pPr>
+            <w:r>
+              <w:rPr>
+                <w:rFonts w:ascii="Fira Sans Extra Condensed" w:hAnsi="Fira Sans Extra Condensed" w:cs="Fira Sans Extra Condensed"/>
+                <w:b/>
+                <w:i w:val="0"/>
+                <w:color w:val="2A6F7F"/>
+                <w:sz w:val="18"/>
+              </w:rPr>
+              <w:t xml:space="preserve">• </w:t>
+            </w:r>
+            <w:r>
+              <w:rPr>
+                <w:rFonts w:ascii="Fira Sans Extra Condensed" w:hAnsi="Fira Sans Extra Condensed" w:cs="Fira Sans Extra Condensed"/>
+                <w:b/>
+                <w:i w:val="0"/>
+                <w:color w:val="1A1A2E"/>
+                <w:sz w:val="18"/>
+              </w:rPr>
               <w:t>Recollir la fitxa S3:</w:t>
             </w:r>
             <w:r>
@@ -7468,7 +8013,7 @@
                 <w:color w:val="1A1A2E"/>
                 <w:sz w:val="18"/>
               </w:rPr>
-              <w:t xml:space="preserve"> és l'evidència del producte final. Recordar que al web hi ha l'Autoavaluació de la SA per repassar-la.</w:t>
+              <w:t xml:space="preserve"> és l'evidència del producte final.</w:t>
             </w:r>
           </w:p>
         </w:tc>
@@ -7675,6 +8220,41 @@
               <w:t xml:space="preserve"> la A diu si el desacord és sobre la dada o sobre la garantia. La C només compara el calaix.</w:t>
             </w:r>
           </w:p>
+          <w:p>
+            <w:pPr>
+              <w:spacing w:after="20" w:before="0"/>
+            </w:pPr>
+            <w:r>
+              <w:rPr>
+                <w:rFonts w:ascii="Fira Sans Extra Condensed" w:hAnsi="Fira Sans Extra Condensed" w:cs="Fira Sans Extra Condensed"/>
+                <w:b/>
+                <w:i w:val="0"/>
+                <w:color w:val="2A6F7F"/>
+                <w:sz w:val="18"/>
+              </w:rPr>
+              <w:t xml:space="preserve">• </w:t>
+            </w:r>
+            <w:r>
+              <w:rPr>
+                <w:rFonts w:ascii="Fira Sans Extra Condensed" w:hAnsi="Fira Sans Extra Condensed" w:cs="Fira Sans Extra Condensed"/>
+                <w:b/>
+                <w:i w:val="0"/>
+                <w:color w:val="1A1A2E"/>
+                <w:sz w:val="18"/>
+              </w:rPr>
+              <w:t>Apartat 4 —</w:t>
+            </w:r>
+            <w:r>
+              <w:rPr>
+                <w:rFonts w:ascii="Fira Sans Extra Condensed" w:hAnsi="Fira Sans Extra Condensed" w:cs="Fira Sans Extra Condensed"/>
+                <w:b w:val="0"/>
+                <w:i w:val="0"/>
+                <w:color w:val="1A1A2E"/>
+                <w:sz w:val="18"/>
+              </w:rPr>
+              <w:t xml:space="preserve"> mateixa exposició i mateixa rúbrica per a tots. La B i la C poden llegir el guió de la fitxa; la A exposa sense llegir i afegeix quin resultat faria canviar el calaix. A tots els nivells, els senyals es diuen amb la frase del cas, no de memòria.</w:t>
+            </w:r>
+          </w:p>
         </w:tc>
       </w:tr>
     </w:tbl>
@@ -7874,6 +8454,56 @@
                 <w:sz w:val="18"/>
               </w:rPr>
               <w:t>Saltar-se l'autoavaluació per falta de temps: és el tancament de la SA.</w:t>
+            </w:r>
+          </w:p>
+          <w:p>
+            <w:pPr>
+              <w:spacing w:after="20" w:before="0"/>
+            </w:pPr>
+            <w:r>
+              <w:rPr>
+                <w:rFonts w:ascii="Fira Sans Extra Condensed" w:hAnsi="Fira Sans Extra Condensed" w:cs="Fira Sans Extra Condensed"/>
+                <w:b/>
+                <w:i w:val="0"/>
+                <w:color w:val="9A3B3B"/>
+                <w:sz w:val="18"/>
+              </w:rPr>
+              <w:t xml:space="preserve">• </w:t>
+            </w:r>
+            <w:r>
+              <w:rPr>
+                <w:rFonts w:ascii="Fira Sans Extra Condensed" w:hAnsi="Fira Sans Extra Condensed" w:cs="Fira Sans Extra Condensed"/>
+                <w:b w:val="0"/>
+                <w:i w:val="0"/>
+                <w:color w:val="9A3B3B"/>
+                <w:sz w:val="18"/>
+              </w:rPr>
+              <w:t>Fer l'exit tiquet sobre el propi cas: ja l'han defensat a l'oral. El GreenBeat mira si ho saben aplicar a un context nou.</w:t>
+            </w:r>
+          </w:p>
+          <w:p>
+            <w:pPr>
+              <w:spacing w:after="20" w:before="0"/>
+            </w:pPr>
+            <w:r>
+              <w:rPr>
+                <w:rFonts w:ascii="Fira Sans Extra Condensed" w:hAnsi="Fira Sans Extra Condensed" w:cs="Fira Sans Extra Condensed"/>
+                <w:b/>
+                <w:i w:val="0"/>
+                <w:color w:val="9A3B3B"/>
+                <w:sz w:val="18"/>
+              </w:rPr>
+              <w:t xml:space="preserve">• </w:t>
+            </w:r>
+            <w:r>
+              <w:rPr>
+                <w:rFonts w:ascii="Fira Sans Extra Condensed" w:hAnsi="Fira Sans Extra Condensed" w:cs="Fira Sans Extra Condensed"/>
+                <w:b w:val="0"/>
+                <w:i w:val="0"/>
+                <w:color w:val="9A3B3B"/>
+                <w:sz w:val="18"/>
+              </w:rPr>
+              <w:t>Deixar que l'oral s'allargui: 1 min 30 s i una pregunta. Si no hi arriben tots, la resta a la sessió següent.</w:t>
             </w:r>
           </w:p>
         </w:tc>
@@ -8030,7 +8660,32 @@
                 <w:color w:val="1A1A2E"/>
                 <w:sz w:val="18"/>
               </w:rPr>
-              <w:t>Fitxa S3 (A/B/C) i exit tiquet.</w:t>
+              <w:t>Fitxa S3 (A/B/C) i exit tiquet (GreenBeat).</w:t>
+            </w:r>
+          </w:p>
+          <w:p>
+            <w:pPr>
+              <w:spacing w:after="20" w:before="0"/>
+            </w:pPr>
+            <w:r>
+              <w:rPr>
+                <w:rFonts w:ascii="Fira Sans Extra Condensed" w:hAnsi="Fira Sans Extra Condensed" w:cs="Fira Sans Extra Condensed"/>
+                <w:b/>
+                <w:i w:val="0"/>
+                <w:color w:val="2A6F7F"/>
+                <w:sz w:val="18"/>
+              </w:rPr>
+              <w:t xml:space="preserve">• </w:t>
+            </w:r>
+            <w:r>
+              <w:rPr>
+                <w:rFonts w:ascii="Fira Sans Extra Condensed" w:hAnsi="Fira Sans Extra Condensed" w:cs="Fira Sans Extra Condensed"/>
+                <w:b w:val="0"/>
+                <w:i w:val="0"/>
+                <w:color w:val="1A1A2E"/>
+                <w:sz w:val="18"/>
+              </w:rPr>
+              <w:t>Rúbrica de l'oral en una llista de classe i cronòmetre visible.</w:t>
             </w:r>
           </w:p>
         </w:tc>
@@ -8548,6 +9203,132 @@
                 <w:color w:val="1A1A2E"/>
                 <w:sz w:val="18"/>
               </w:rPr>
+              <w:t>App del laboratori de la prova justa (A·B: 5 passos + pas 6 per a la A · C: 3 passos)</w:t>
+            </w:r>
+          </w:p>
+        </w:tc>
+        <w:tc>
+          <w:tcPr>
+            <w:tcW w:type="dxa" w:w="1247"/>
+          </w:tcPr>
+          <w:p>
+            <w:pPr>
+              <w:spacing w:after="0" w:before="0"/>
+            </w:pPr>
+            <w:r>
+              <w:rPr>
+                <w:rFonts w:ascii="Fira Sans Extra Condensed" w:hAnsi="Fira Sans Extra Condensed" w:cs="Fira Sans Extra Condensed"/>
+                <w:b w:val="0"/>
+                <w:i w:val="0"/>
+                <w:color w:val="1A1A2E"/>
+                <w:sz w:val="18"/>
+              </w:rPr>
+              <w:t>S2</w:t>
+            </w:r>
+          </w:p>
+        </w:tc>
+        <w:tc>
+          <w:tcPr>
+            <w:tcW w:type="dxa" w:w="4989"/>
+          </w:tcPr>
+          <w:p>
+            <w:pPr>
+              <w:spacing w:after="0" w:before="0"/>
+            </w:pPr>
+            <w:r>
+              <w:rPr>
+                <w:rFonts w:ascii="Fira Sans Extra Condensed" w:hAnsi="Fira Sans Extra Condensed" w:cs="Fira Sans Extra Condensed"/>
+                <w:b w:val="0"/>
+                <w:i w:val="0"/>
+                <w:color w:val="1A1A2E"/>
+                <w:sz w:val="18"/>
+              </w:rPr>
+              <w:t>Web, a l'apartat 3 de la pàgina de la sessió</w:t>
+            </w:r>
+          </w:p>
+        </w:tc>
+      </w:tr>
+      <w:tr>
+        <w:tc>
+          <w:tcPr>
+            <w:tcW w:type="dxa" w:w="3628"/>
+            <w:shd w:val="clear" w:fill="E8F2F4"/>
+          </w:tcPr>
+          <w:p>
+            <w:pPr>
+              <w:spacing w:after="0" w:before="0"/>
+            </w:pPr>
+            <w:r>
+              <w:rPr>
+                <w:rFonts w:ascii="Fira Sans Extra Condensed" w:hAnsi="Fira Sans Extra Condensed" w:cs="Fira Sans Extra Condensed"/>
+                <w:b/>
+                <w:i w:val="0"/>
+                <w:color w:val="1A1A2E"/>
+                <w:sz w:val="18"/>
+              </w:rPr>
+              <w:t>Fig. «Anatomia d'una prova justa»</w:t>
+            </w:r>
+          </w:p>
+        </w:tc>
+        <w:tc>
+          <w:tcPr>
+            <w:tcW w:type="dxa" w:w="1247"/>
+          </w:tcPr>
+          <w:p>
+            <w:pPr>
+              <w:spacing w:after="0" w:before="0"/>
+            </w:pPr>
+            <w:r>
+              <w:rPr>
+                <w:rFonts w:ascii="Fira Sans Extra Condensed" w:hAnsi="Fira Sans Extra Condensed" w:cs="Fira Sans Extra Condensed"/>
+                <w:b w:val="0"/>
+                <w:i w:val="0"/>
+                <w:color w:val="1A1A2E"/>
+                <w:sz w:val="18"/>
+              </w:rPr>
+              <w:t>S2</w:t>
+            </w:r>
+          </w:p>
+        </w:tc>
+        <w:tc>
+          <w:tcPr>
+            <w:tcW w:type="dxa" w:w="4989"/>
+          </w:tcPr>
+          <w:p>
+            <w:pPr>
+              <w:spacing w:after="0" w:before="0"/>
+            </w:pPr>
+            <w:r>
+              <w:rPr>
+                <w:rFonts w:ascii="Fira Sans Extra Condensed" w:hAnsi="Fira Sans Extra Condensed" w:cs="Fira Sans Extra Condensed"/>
+                <w:b w:val="0"/>
+                <w:i w:val="0"/>
+                <w:color w:val="1A1A2E"/>
+                <w:sz w:val="18"/>
+              </w:rPr>
+              <w:t>Web (apartat 3) i projectada a la posada en comú</w:t>
+            </w:r>
+          </w:p>
+        </w:tc>
+      </w:tr>
+      <w:tr>
+        <w:tc>
+          <w:tcPr>
+            <w:tcW w:type="dxa" w:w="3628"/>
+            <w:shd w:val="clear" w:fill="E8F2F4"/>
+          </w:tcPr>
+          <w:p>
+            <w:pPr>
+              <w:spacing w:after="0" w:before="0"/>
+            </w:pPr>
+            <w:r>
+              <w:rPr>
+                <w:rFonts w:ascii="Fira Sans Extra Condensed" w:hAnsi="Fira Sans Extra Condensed" w:cs="Fira Sans Extra Condensed"/>
+                <w:b/>
+                <w:i w:val="0"/>
+                <w:color w:val="1A1A2E"/>
+                <w:sz w:val="18"/>
+              </w:rPr>
               <w:t>Casos de reserva (4)</w:t>
             </w:r>
           </w:p>
@@ -9395,7 +10176,7 @@
                 <w:color w:val="1A1A2E"/>
                 <w:sz w:val="18"/>
               </w:rPr>
-              <w:t>S1: escala de certeses i garanties</w:t>
+              <w:t>S1: escala de certeses i garanties · S3: conclusió i resposta a la pregunta a l'exposició oral</w:t>
             </w:r>
           </w:p>
         </w:tc>
@@ -9438,7 +10219,7 @@
                 <w:color w:val="1A1A2E"/>
                 <w:sz w:val="18"/>
               </w:rPr>
-              <w:t>Criteri nuclear: S1 (detector i exit tiquet), S2 (puzle), S3 (cas propi)</w:t>
+              <w:t>Criteri nuclear: S1 (detector i exit tiquet), S2 (puzle), S3 (cas propi i exposició oral)</w:t>
             </w:r>
           </w:p>
         </w:tc>
@@ -9481,7 +10262,50 @@
                 <w:color w:val="1A1A2E"/>
                 <w:sz w:val="18"/>
               </w:rPr>
-              <w:t>S3: la prova que faria caure el cas propi i exit tiquet</w:t>
+              <w:t>S3: la promesa com a hipòtesi a l'oral i exit tiquet GreenBeat (transferència)</w:t>
+            </w:r>
+          </w:p>
+        </w:tc>
+      </w:tr>
+      <w:tr>
+        <w:tc>
+          <w:tcPr>
+            <w:tcW w:type="dxa" w:w="5896"/>
+            <w:shd w:val="clear" w:fill="E8F2F4"/>
+          </w:tcPr>
+          <w:p>
+            <w:pPr>
+              <w:spacing w:after="0" w:before="0"/>
+            </w:pPr>
+            <w:r>
+              <w:rPr>
+                <w:rFonts w:ascii="Fira Sans Extra Condensed" w:hAnsi="Fira Sans Extra Condensed" w:cs="Fira Sans Extra Condensed"/>
+                <w:b/>
+                <w:i w:val="0"/>
+                <w:color w:val="1A1A2E"/>
+                <w:sz w:val="18"/>
+              </w:rPr>
+              <w:t>CE3 · 3.2 — Dissenyar, fent servir metodologies pròpies de la ciència, procediments de recerca que impliquin l’ús de la deducció, el treball experimental i el raonament logicomatemàtic, [el text oficial acaba així]</w:t>
+            </w:r>
+          </w:p>
+        </w:tc>
+        <w:tc>
+          <w:tcPr>
+            <w:tcW w:type="dxa" w:w="3969"/>
+          </w:tcPr>
+          <w:p>
+            <w:pPr>
+              <w:spacing w:after="0" w:before="0"/>
+            </w:pPr>
+            <w:r>
+              <w:rPr>
+                <w:rFonts w:ascii="Fira Sans Extra Condensed" w:hAnsi="Fira Sans Extra Condensed" w:cs="Fira Sans Extra Condensed"/>
+                <w:b w:val="0"/>
+                <w:i w:val="0"/>
+                <w:color w:val="1A1A2E"/>
+                <w:sz w:val="18"/>
+              </w:rPr>
+              <w:t>S2: laboratori de la prova justa i motlle · S3: la prova justa a l'exposició oral</w:t>
             </w:r>
           </w:p>
         </w:tc>

</xml_diff>